<commit_message>
Fix names in fix-report
</commit_message>
<xml_diff>
--- a/bug-fix_report.docx
+++ b/bug-fix_report.docx
@@ -1,6 +1,6 @@
 
 <file path=word/document.xml><?xml version="1.0" encoding="utf-8"?>
-<w:document xmlns:wpc="http://schemas.microsoft.com/office/word/2010/wordprocessingCanvas" xmlns:cx="http://schemas.microsoft.com/office/drawing/2014/chartex" xmlns:cx1="http://schemas.microsoft.com/office/drawing/2015/9/8/chartex" xmlns:cx2="http://schemas.microsoft.com/office/drawing/2015/10/21/chartex" xmlns:cx3="http://schemas.microsoft.com/office/drawing/2016/5/9/chartex" xmlns:cx4="http://schemas.microsoft.com/office/drawing/2016/5/10/chartex" xmlns:cx5="http://schemas.microsoft.com/office/drawing/2016/5/11/chartex" xmlns:cx6="http://schemas.microsoft.com/office/drawing/2016/5/12/chartex" xmlns:cx7="http://schemas.microsoft.com/office/drawing/2016/5/13/chartex" xmlns:cx8="http://schemas.microsoft.com/office/drawing/2016/5/14/chartex" xmlns:mc="http://schemas.openxmlformats.org/markup-compatibility/2006" xmlns:aink="http://schemas.microsoft.com/office/drawing/2016/ink" xmlns:am3d="http://schemas.microsoft.com/office/drawing/2017/model3d" xmlns:o="urn:schemas-microsoft-com:office:office" xmlns:oel="http://schemas.microsoft.com/office/2019/extlst" xmlns:r="http://schemas.openxmlformats.org/officeDocument/2006/relationships" xmlns:m="http://schemas.openxmlformats.org/officeDocument/2006/math" xmlns:v="urn:schemas-microsoft-com:vml" xmlns:wp14="http://schemas.microsoft.com/office/word/2010/wordprocessingDrawing" xmlns:wp="http://schemas.openxmlformats.org/drawingml/2006/wordprocessingDrawing" xmlns:w10="urn:schemas-microsoft-com:office:word" xmlns:w="http://schemas.openxmlformats.org/wordprocessingml/2006/main" xmlns:w14="http://schemas.microsoft.com/office/word/2010/wordml" xmlns:w15="http://schemas.microsoft.com/office/word/2012/wordml" xmlns:w16cex="http://schemas.microsoft.com/office/word/2018/wordml/cex" xmlns:w16cid="http://schemas.microsoft.com/office/word/2016/wordml/cid" xmlns:w16="http://schemas.microsoft.com/office/word/2018/wordml" xmlns:w16du="http://schemas.microsoft.com/office/word/2023/wordml/word16du" xmlns:w16sdtdh="http://schemas.microsoft.com/office/word/2020/wordml/sdtdatahash" xmlns:w16sdtfl="http://schemas.microsoft.com/office/word/2024/wordml/sdtformatlock" xmlns:w16se="http://schemas.microsoft.com/office/word/2015/wordml/symex" xmlns:wpg="http://schemas.microsoft.com/office/word/2010/wordprocessingGroup" xmlns:wpi="http://schemas.microsoft.com/office/word/2010/wordprocessingInk" xmlns:wne="http://schemas.microsoft.com/office/word/2006/wordml" xmlns:wps="http://schemas.microsoft.com/office/word/2010/wordprocessingShape" mc:Ignorable="w14 w15 w16se w16cid w16 w16cex w16sdtdh w16sdtfl w16du wp14">
+<w:document xmlns:wpc="http://schemas.microsoft.com/office/word/2010/wordprocessingCanvas" xmlns:cx="http://schemas.microsoft.com/office/drawing/2014/chartex" xmlns:cx1="http://schemas.microsoft.com/office/drawing/2015/9/8/chartex" xmlns:cx2="http://schemas.microsoft.com/office/drawing/2015/10/21/chartex" xmlns:cx3="http://schemas.microsoft.com/office/drawing/2016/5/9/chartex" xmlns:cx4="http://schemas.microsoft.com/office/drawing/2016/5/10/chartex" xmlns:cx5="http://schemas.microsoft.com/office/drawing/2016/5/11/chartex" xmlns:cx6="http://schemas.microsoft.com/office/drawing/2016/5/12/chartex" xmlns:cx7="http://schemas.microsoft.com/office/drawing/2016/5/13/chartex" xmlns:cx8="http://schemas.microsoft.com/office/drawing/2016/5/14/chartex" xmlns:mc="http://schemas.openxmlformats.org/markup-compatibility/2006" xmlns:aink="http://schemas.microsoft.com/office/drawing/2016/ink" xmlns:am3d="http://schemas.microsoft.com/office/drawing/2017/model3d" xmlns:o="urn:schemas-microsoft-com:office:office" xmlns:r="http://schemas.openxmlformats.org/officeDocument/2006/relationships" xmlns:m="http://schemas.openxmlformats.org/officeDocument/2006/math" xmlns:v="urn:schemas-microsoft-com:vml" xmlns:wp14="http://schemas.microsoft.com/office/word/2010/wordprocessingDrawing" xmlns:wp="http://schemas.openxmlformats.org/drawingml/2006/wordprocessingDrawing" xmlns:w10="urn:schemas-microsoft-com:office:word" xmlns:w="http://schemas.openxmlformats.org/wordprocessingml/2006/main" xmlns:w14="http://schemas.microsoft.com/office/word/2010/wordml" xmlns:w15="http://schemas.microsoft.com/office/word/2012/wordml" xmlns:w16cex="http://schemas.microsoft.com/office/word/2018/wordml/cex" xmlns:w16cid="http://schemas.microsoft.com/office/word/2016/wordml/cid" xmlns:w16="http://schemas.microsoft.com/office/word/2018/wordml" xmlns:w16sdtdh="http://schemas.microsoft.com/office/word/2020/wordml/sdtdatahash" xmlns:w16se="http://schemas.microsoft.com/office/word/2015/wordml/symex" xmlns:wpg="http://schemas.microsoft.com/office/word/2010/wordprocessingGroup" xmlns:wpi="http://schemas.microsoft.com/office/word/2010/wordprocessingInk" xmlns:wne="http://schemas.microsoft.com/office/word/2006/wordml" xmlns:wps="http://schemas.microsoft.com/office/word/2010/wordprocessingShape" mc:Ignorable="w14 w15 w16se w16cid w16 w16cex w16sdtdh wp14">
   <w:body>
     <w:p>
       <w:pPr>
@@ -501,7 +501,14 @@
           <w:u w:val="single"/>
           <w:lang w:val="en-US"/>
         </w:rPr>
-        <w:t>Heorghi</w:t>
+        <w:t>Heorhi</w:t>
+      </w:r>
+      <w:r>
+        <w:rPr>
+          <w:u w:val="single"/>
+          <w:lang w:val="en-US"/>
+        </w:rPr>
+        <w:t>i</w:t>
       </w:r>
       <w:proofErr w:type="spellEnd"/>
       <w:r>
@@ -586,7 +593,6 @@
         </w:rPr>
       </w:pPr>
       <w:proofErr w:type="spellStart"/>
-      <w:proofErr w:type="gramStart"/>
       <w:r>
         <w:rPr>
           <w:b/>
@@ -602,10 +608,18 @@
         </w:rPr>
         <w:t xml:space="preserve">  2026</w:t>
       </w:r>
-      <w:proofErr w:type="gramEnd"/>
     </w:p>
     <w:sdt>
       <w:sdtPr>
+        <w:rPr>
+          <w:rFonts w:ascii="Times New Roman" w:eastAsia="Times New Roman" w:hAnsi="Times New Roman" w:cs="Times New Roman"/>
+          <w:b w:val="0"/>
+          <w:bCs w:val="0"/>
+          <w:color w:val="auto"/>
+          <w:sz w:val="24"/>
+          <w:szCs w:val="24"/>
+          <w:lang w:val="ru-RU"/>
+        </w:rPr>
         <w:id w:val="281774772"/>
         <w:docPartObj>
           <w:docPartGallery w:val="Table of Contents"/>
@@ -614,20 +628,13 @@
       </w:sdtPr>
       <w:sdtEndPr>
         <w:rPr>
-          <w:rFonts w:ascii="Times New Roman" w:eastAsia="Times New Roman" w:hAnsi="Times New Roman" w:cs="Times New Roman"/>
-          <w:b w:val="0"/>
-          <w:bCs w:val="0"/>
           <w:noProof/>
-          <w:color w:val="auto"/>
-          <w:sz w:val="24"/>
-          <w:szCs w:val="24"/>
-          <w:lang w:val="ru-RU"/>
         </w:rPr>
       </w:sdtEndPr>
       <w:sdtContent>
         <w:p>
           <w:pPr>
-            <w:pStyle w:val="TOCHeading"/>
+            <w:pStyle w:val="ac"/>
             <w:jc w:val="center"/>
             <w:rPr>
               <w:rFonts w:ascii="Times New Roman" w:hAnsi="Times New Roman" w:cs="Times New Roman"/>
@@ -649,7 +656,7 @@
         <w:p/>
         <w:p>
           <w:pPr>
-            <w:pStyle w:val="TOC1"/>
+            <w:pStyle w:val="11"/>
             <w:tabs>
               <w:tab w:val="right" w:leader="dot" w:pos="9350"/>
             </w:tabs>
@@ -659,11 +666,9 @@
               <w:bCs w:val="0"/>
               <w:caps w:val="0"/>
               <w:noProof/>
-              <w:kern w:val="2"/>
-              <w:sz w:val="24"/>
-              <w:szCs w:val="24"/>
-              <w:lang w:val="en-US"/>
-              <w14:ligatures w14:val="standardContextual"/>
+              <w:sz w:val="22"/>
+              <w:szCs w:val="22"/>
+              <w:lang w:val="ru-MD" w:eastAsia="ru-MD"/>
             </w:rPr>
           </w:pPr>
           <w:r>
@@ -675,10 +680,10 @@
           <w:r>
             <w:fldChar w:fldCharType="separate"/>
           </w:r>
-          <w:hyperlink w:anchor="_Toc225723116" w:history="1">
-            <w:r>
-              <w:rPr>
-                <w:rStyle w:val="Hyperlink"/>
+          <w:hyperlink w:anchor="_Toc225776824" w:history="1">
+            <w:r>
+              <w:rPr>
+                <w:rStyle w:val="ad"/>
                 <w:noProof/>
               </w:rPr>
               <w:t>ВВЕДЕНИЕ</w:t>
@@ -702,7 +707,7 @@
                 <w:noProof/>
                 <w:webHidden/>
               </w:rPr>
-              <w:instrText xml:space="preserve"> PAGEREF _Toc225723116 \h </w:instrText>
+              <w:instrText xml:space="preserve"> PAGEREF _Toc225776824 \h </w:instrText>
             </w:r>
             <w:r>
               <w:rPr>
@@ -735,7 +740,7 @@
         </w:p>
         <w:p>
           <w:pPr>
-            <w:pStyle w:val="TOC1"/>
+            <w:pStyle w:val="11"/>
             <w:tabs>
               <w:tab w:val="left" w:pos="1200"/>
               <w:tab w:val="right" w:leader="dot" w:pos="9350"/>
@@ -746,17 +751,15 @@
               <w:bCs w:val="0"/>
               <w:caps w:val="0"/>
               <w:noProof/>
-              <w:kern w:val="2"/>
-              <w:sz w:val="24"/>
-              <w:szCs w:val="24"/>
-              <w:lang w:val="en-US"/>
-              <w14:ligatures w14:val="standardContextual"/>
+              <w:sz w:val="22"/>
+              <w:szCs w:val="22"/>
+              <w:lang w:val="ru-MD" w:eastAsia="ru-MD"/>
             </w:rPr>
           </w:pPr>
-          <w:hyperlink w:anchor="_Toc225723117" w:history="1">
-            <w:r>
-              <w:rPr>
-                <w:rStyle w:val="Hyperlink"/>
+          <w:hyperlink w:anchor="_Toc225776825" w:history="1">
+            <w:r>
+              <w:rPr>
+                <w:rStyle w:val="ad"/>
                 <w:noProof/>
               </w:rPr>
               <w:t>1</w:t>
@@ -768,17 +771,15 @@
                 <w:bCs w:val="0"/>
                 <w:caps w:val="0"/>
                 <w:noProof/>
-                <w:kern w:val="2"/>
-                <w:sz w:val="24"/>
-                <w:szCs w:val="24"/>
-                <w:lang w:val="en-US"/>
-                <w14:ligatures w14:val="standardContextual"/>
+                <w:sz w:val="22"/>
+                <w:szCs w:val="22"/>
+                <w:lang w:val="ru-MD" w:eastAsia="ru-MD"/>
               </w:rPr>
               <w:tab/>
             </w:r>
             <w:r>
               <w:rPr>
-                <w:rStyle w:val="Hyperlink"/>
+                <w:rStyle w:val="ad"/>
                 <w:noProof/>
               </w:rPr>
               <w:t>ИСПРАВЛЕНИЯ</w:t>
@@ -802,7 +803,7 @@
                 <w:noProof/>
                 <w:webHidden/>
               </w:rPr>
-              <w:instrText xml:space="preserve"> PAGEREF _Toc225723117 \h </w:instrText>
+              <w:instrText xml:space="preserve"> PAGEREF _Toc225776825 \h </w:instrText>
             </w:r>
             <w:r>
               <w:rPr>
@@ -835,7 +836,7 @@
         </w:p>
         <w:p>
           <w:pPr>
-            <w:pStyle w:val="TOC1"/>
+            <w:pStyle w:val="11"/>
             <w:tabs>
               <w:tab w:val="right" w:leader="dot" w:pos="9350"/>
             </w:tabs>
@@ -845,17 +846,15 @@
               <w:bCs w:val="0"/>
               <w:caps w:val="0"/>
               <w:noProof/>
-              <w:kern w:val="2"/>
-              <w:sz w:val="24"/>
-              <w:szCs w:val="24"/>
-              <w:lang w:val="en-US"/>
-              <w14:ligatures w14:val="standardContextual"/>
+              <w:sz w:val="22"/>
+              <w:szCs w:val="22"/>
+              <w:lang w:val="ru-MD" w:eastAsia="ru-MD"/>
             </w:rPr>
           </w:pPr>
-          <w:hyperlink w:anchor="_Toc225723118" w:history="1">
-            <w:r>
-              <w:rPr>
-                <w:rStyle w:val="Hyperlink"/>
+          <w:hyperlink w:anchor="_Toc225776826" w:history="1">
+            <w:r>
+              <w:rPr>
+                <w:rStyle w:val="ad"/>
                 <w:noProof/>
               </w:rPr>
               <w:t>ВЫВОДЫ</w:t>
@@ -879,7 +878,7 @@
                 <w:noProof/>
                 <w:webHidden/>
               </w:rPr>
-              <w:instrText xml:space="preserve"> PAGEREF _Toc225723118 \h </w:instrText>
+              <w:instrText xml:space="preserve"> PAGEREF _Toc225776826 \h </w:instrText>
             </w:r>
             <w:r>
               <w:rPr>
@@ -899,7 +898,7 @@
                 <w:noProof/>
                 <w:webHidden/>
               </w:rPr>
-              <w:t>6</w:t>
+              <w:t>7</w:t>
             </w:r>
             <w:r>
               <w:rPr>
@@ -945,10 +944,16 @@
     </w:p>
     <w:p>
       <w:pPr>
-        <w:pStyle w:val="Heading1"/>
+        <w:pStyle w:val="1"/>
+        <w:rPr>
+          <w:lang w:val="ru-MD"/>
+        </w:rPr>
       </w:pPr>
-      <w:bookmarkStart w:id="0" w:name="_Toc225723116"/>
-      <w:r>
+      <w:bookmarkStart w:id="0" w:name="_Toc225776824"/>
+      <w:r>
+        <w:rPr>
+          <w:lang w:val="ru-MD"/>
+        </w:rPr>
         <w:lastRenderedPageBreak/>
         <w:t>ВВЕДЕНИЕ</w:t>
       </w:r>
@@ -1034,28 +1039,14 @@
     </w:p>
     <w:p>
       <w:pPr>
-        <w:pStyle w:val="ListParagraph"/>
+        <w:pStyle w:val="a7"/>
         <w:numPr>
           <w:ilvl w:val="0"/>
           <w:numId w:val="1"/>
         </w:numPr>
       </w:pPr>
       <w:r>
-        <w:t>Устранение критических ошибок</w:t>
-      </w:r>
-      <w:proofErr w:type="gramStart"/>
-      <w:r>
-        <w:t xml:space="preserve">: </w:t>
-      </w:r>
-      <w:r>
-        <w:t>И</w:t>
-      </w:r>
-      <w:r>
-        <w:t>справить</w:t>
-      </w:r>
-      <w:proofErr w:type="gramEnd"/>
-      <w:r>
-        <w:t xml:space="preserve"> </w:t>
+        <w:t xml:space="preserve">Устранение критических ошибок: Исправить </w:t>
       </w:r>
       <w:proofErr w:type="spellStart"/>
       <w:r>
@@ -1068,42 +1059,26 @@
     </w:p>
     <w:p>
       <w:pPr>
-        <w:pStyle w:val="ListParagraph"/>
+        <w:pStyle w:val="a7"/>
         <w:numPr>
           <w:ilvl w:val="0"/>
           <w:numId w:val="1"/>
         </w:numPr>
       </w:pPr>
       <w:r>
-        <w:t>Коррекция логики и типов данных</w:t>
-      </w:r>
-      <w:proofErr w:type="gramStart"/>
-      <w:r>
-        <w:t>: Обеспечить</w:t>
-      </w:r>
-      <w:proofErr w:type="gramEnd"/>
-      <w:r>
-        <w:t xml:space="preserve"> точность расчетов (например, высоты прыжка) и правильную обработку столкновений.</w:t>
+        <w:t>Коррекция логики и типов данных: Обеспечить точность расчетов (например, высоты прыжка) и правильную обработку столкновений.</w:t>
       </w:r>
     </w:p>
     <w:p>
       <w:pPr>
-        <w:pStyle w:val="ListParagraph"/>
+        <w:pStyle w:val="a7"/>
         <w:numPr>
           <w:ilvl w:val="0"/>
           <w:numId w:val="1"/>
         </w:numPr>
       </w:pPr>
       <w:r>
-        <w:t>Улучшение пользовательского опыта</w:t>
-      </w:r>
-      <w:proofErr w:type="gramStart"/>
-      <w:r>
-        <w:t>: Исправить</w:t>
-      </w:r>
-      <w:proofErr w:type="gramEnd"/>
-      <w:r>
-        <w:t xml:space="preserve"> визуальные и механические баги (анимации, </w:t>
+        <w:t xml:space="preserve">Улучшение пользовательского опыта: Исправить визуальные и механические баги (анимации, </w:t>
       </w:r>
       <w:proofErr w:type="spellStart"/>
       <w:r>
@@ -1116,42 +1091,26 @@
     </w:p>
     <w:p>
       <w:pPr>
-        <w:pStyle w:val="ListParagraph"/>
+        <w:pStyle w:val="a7"/>
         <w:numPr>
           <w:ilvl w:val="0"/>
           <w:numId w:val="1"/>
         </w:numPr>
       </w:pPr>
       <w:r>
-        <w:t>Оптимизация тестов</w:t>
-      </w:r>
-      <w:proofErr w:type="gramStart"/>
-      <w:r>
-        <w:t>: Обновить</w:t>
-      </w:r>
-      <w:proofErr w:type="gramEnd"/>
-      <w:r>
-        <w:t xml:space="preserve"> юнит-тесты для лучшего покрытия и корректности, включая использование правильных методов инициализации.</w:t>
+        <w:t>Оптимизация тестов: Обновить юнит-тесты для лучшего покрытия и корректности, включая использование правильных методов инициализации.</w:t>
       </w:r>
     </w:p>
     <w:p>
       <w:pPr>
-        <w:pStyle w:val="ListParagraph"/>
+        <w:pStyle w:val="a7"/>
         <w:numPr>
           <w:ilvl w:val="0"/>
           <w:numId w:val="1"/>
         </w:numPr>
       </w:pPr>
       <w:r>
-        <w:t>Повышение надежности</w:t>
-      </w:r>
-      <w:proofErr w:type="gramStart"/>
-      <w:r>
-        <w:t>: Сделать</w:t>
-      </w:r>
-      <w:proofErr w:type="gramEnd"/>
-      <w:r>
-        <w:t xml:space="preserve"> код более устойчивым к </w:t>
+        <w:t xml:space="preserve">Повышение надежности: Сделать код более устойчивым к </w:t>
       </w:r>
       <w:proofErr w:type="spellStart"/>
       <w:r>
@@ -1173,7 +1132,7 @@
           <w:kern w:val="2"/>
           <w:sz w:val="32"/>
           <w:szCs w:val="32"/>
-          <w:lang w:val="en-US"/>
+          <w:lang w:val="ru-MD"/>
           <w14:ligatures w14:val="standardContextual"/>
         </w:rPr>
       </w:pPr>
@@ -1183,7 +1142,7 @@
     </w:p>
     <w:p>
       <w:pPr>
-        <w:pStyle w:val="Heading1"/>
+        <w:pStyle w:val="1"/>
         <w:numPr>
           <w:ilvl w:val="0"/>
           <w:numId w:val="3"/>
@@ -1192,7 +1151,7 @@
           <w:lang w:val="ru-RU"/>
         </w:rPr>
       </w:pPr>
-      <w:bookmarkStart w:id="1" w:name="_Toc225723117"/>
+      <w:bookmarkStart w:id="1" w:name="_Toc225776825"/>
       <w:r>
         <w:lastRenderedPageBreak/>
         <w:t>ИСПРАВЛЕНИЯ</w:t>
@@ -1662,23 +1621,13 @@
               </w:rPr>
               <w:t> на </w:t>
             </w:r>
-            <w:proofErr w:type="gramStart"/>
-            <w:r>
-              <w:rPr>
-                <w:rFonts w:eastAsiaTheme="majorEastAsia"/>
-                <w:sz w:val="20"/>
-                <w:szCs w:val="20"/>
-              </w:rPr>
-              <w:t>0..</w:t>
-            </w:r>
-            <w:proofErr w:type="gramEnd"/>
-            <w:r>
-              <w:rPr>
-                <w:rFonts w:eastAsiaTheme="majorEastAsia"/>
-                <w:sz w:val="20"/>
-                <w:szCs w:val="20"/>
-              </w:rPr>
-              <w:t>300.0</w:t>
+            <w:r>
+              <w:rPr>
+                <w:rFonts w:eastAsiaTheme="majorEastAsia"/>
+                <w:sz w:val="20"/>
+                <w:szCs w:val="20"/>
+              </w:rPr>
+              <w:t>0..300.0</w:t>
             </w:r>
             <w:r>
               <w:rPr>
@@ -1722,18 +1671,95 @@
                 <w:sz w:val="20"/>
                 <w:szCs w:val="20"/>
               </w:rPr>
-              <w:t>handle_</w:t>
-            </w:r>
-            <w:proofErr w:type="gramStart"/>
-            <w:r>
-              <w:rPr>
-                <w:rFonts w:eastAsiaTheme="majorEastAsia"/>
-                <w:sz w:val="20"/>
-                <w:szCs w:val="20"/>
-              </w:rPr>
-              <w:t>cols(</w:t>
-            </w:r>
-            <w:proofErr w:type="gramEnd"/>
+              <w:t>handle_cols()</w:t>
+            </w:r>
+            <w:r>
+              <w:rPr>
+                <w:sz w:val="20"/>
+                <w:szCs w:val="20"/>
+              </w:rPr>
+              <w:t> заменен </w:t>
+            </w:r>
+            <w:r>
+              <w:rPr>
+                <w:rFonts w:eastAsiaTheme="majorEastAsia"/>
+                <w:sz w:val="20"/>
+                <w:szCs w:val="20"/>
+              </w:rPr>
+              <w:t>last_velocity.abs()</w:t>
+            </w:r>
+            <w:r>
+              <w:rPr>
+                <w:sz w:val="20"/>
+                <w:szCs w:val="20"/>
+              </w:rPr>
+              <w:t> на </w:t>
+            </w:r>
+            <w:r>
+              <w:rPr>
+                <w:rFonts w:eastAsiaTheme="majorEastAsia"/>
+                <w:sz w:val="20"/>
+                <w:szCs w:val="20"/>
+              </w:rPr>
+              <w:t>last_velocity.length()</w:t>
+            </w:r>
+            <w:r>
+              <w:rPr>
+                <w:sz w:val="20"/>
+                <w:szCs w:val="20"/>
+              </w:rPr>
+              <w:t> для корректного расчета импульса.</w:t>
+            </w:r>
+            <w:r>
+              <w:rPr>
+                <w:sz w:val="20"/>
+                <w:szCs w:val="20"/>
+              </w:rPr>
+              <w:t xml:space="preserve"> </w:t>
+            </w:r>
+            <w:r>
+              <w:rPr>
+                <w:sz w:val="20"/>
+                <w:szCs w:val="20"/>
+              </w:rPr>
+              <w:t xml:space="preserve"> В </w:t>
+            </w:r>
+            <w:r>
+              <w:rPr>
+                <w:rFonts w:eastAsiaTheme="majorEastAsia"/>
+                <w:sz w:val="20"/>
+                <w:szCs w:val="20"/>
+              </w:rPr>
+              <w:t>_</w:t>
+            </w:r>
+            <w:proofErr w:type="spellStart"/>
+            <w:r>
+              <w:rPr>
+                <w:rFonts w:eastAsiaTheme="majorEastAsia"/>
+                <w:sz w:val="20"/>
+                <w:szCs w:val="20"/>
+              </w:rPr>
+              <w:t>on_hitbox_body_entered</w:t>
+            </w:r>
+            <w:proofErr w:type="spellEnd"/>
+            <w:r>
+              <w:rPr>
+                <w:rFonts w:eastAsiaTheme="majorEastAsia"/>
+                <w:sz w:val="20"/>
+                <w:szCs w:val="20"/>
+              </w:rPr>
+              <w:t>(</w:t>
+            </w:r>
+            <w:proofErr w:type="spellStart"/>
+            <w:r>
+              <w:rPr>
+                <w:rFonts w:eastAsiaTheme="majorEastAsia"/>
+                <w:sz w:val="20"/>
+                <w:szCs w:val="20"/>
+              </w:rPr>
+              <w:t>body</w:t>
+            </w:r>
+            <w:proofErr w:type="spellEnd"/>
             <w:r>
               <w:rPr>
                 <w:rFonts w:eastAsiaTheme="majorEastAsia"/>
@@ -1747,87 +1773,7 @@
                 <w:sz w:val="20"/>
                 <w:szCs w:val="20"/>
               </w:rPr>
-              <w:t> заменен </w:t>
-            </w:r>
-            <w:proofErr w:type="gramStart"/>
-            <w:r>
-              <w:rPr>
-                <w:rFonts w:eastAsiaTheme="majorEastAsia"/>
-                <w:sz w:val="20"/>
-                <w:szCs w:val="20"/>
-              </w:rPr>
-              <w:t>last_velocity.abs(</w:t>
-            </w:r>
-            <w:proofErr w:type="gramEnd"/>
-            <w:r>
-              <w:rPr>
-                <w:rFonts w:eastAsiaTheme="majorEastAsia"/>
-                <w:sz w:val="20"/>
-                <w:szCs w:val="20"/>
-              </w:rPr>
-              <w:t>)</w:t>
-            </w:r>
-            <w:r>
-              <w:rPr>
-                <w:sz w:val="20"/>
-                <w:szCs w:val="20"/>
-              </w:rPr>
-              <w:t> на </w:t>
-            </w:r>
-            <w:r>
-              <w:rPr>
-                <w:rFonts w:eastAsiaTheme="majorEastAsia"/>
-                <w:sz w:val="20"/>
-                <w:szCs w:val="20"/>
-              </w:rPr>
-              <w:t>last_</w:t>
-            </w:r>
-            <w:proofErr w:type="gramStart"/>
-            <w:r>
-              <w:rPr>
-                <w:rFonts w:eastAsiaTheme="majorEastAsia"/>
-                <w:sz w:val="20"/>
-                <w:szCs w:val="20"/>
-              </w:rPr>
-              <w:t>velocity.length</w:t>
-            </w:r>
-            <w:proofErr w:type="gramEnd"/>
-            <w:r>
-              <w:rPr>
-                <w:rFonts w:eastAsiaTheme="majorEastAsia"/>
-                <w:sz w:val="20"/>
-                <w:szCs w:val="20"/>
-              </w:rPr>
-              <w:t>()</w:t>
-            </w:r>
-            <w:r>
-              <w:rPr>
-                <w:sz w:val="20"/>
-                <w:szCs w:val="20"/>
-              </w:rPr>
-              <w:t> для корректного расчета импульса.</w:t>
-            </w:r>
-            <w:r>
-              <w:rPr>
-                <w:sz w:val="20"/>
-                <w:szCs w:val="20"/>
-              </w:rPr>
-              <w:t xml:space="preserve"> </w:t>
-            </w:r>
-            <w:r>
-              <w:rPr>
-                <w:sz w:val="20"/>
-                <w:szCs w:val="20"/>
-              </w:rPr>
-              <w:t xml:space="preserve"> В </w:t>
-            </w:r>
-            <w:r>
-              <w:rPr>
-                <w:rFonts w:eastAsiaTheme="majorEastAsia"/>
-                <w:sz w:val="20"/>
-                <w:szCs w:val="20"/>
-              </w:rPr>
-              <w:t>_</w:t>
+              <w:t> добавлена проверка </w:t>
             </w:r>
             <w:proofErr w:type="spellStart"/>
             <w:r>
@@ -1836,7 +1782,7 @@
                 <w:sz w:val="20"/>
                 <w:szCs w:val="20"/>
               </w:rPr>
-              <w:t>on_hitbox_body_entered</w:t>
+              <w:t>body</w:t>
             </w:r>
             <w:proofErr w:type="spellEnd"/>
             <w:r>
@@ -1845,7 +1791,7 @@
                 <w:sz w:val="20"/>
                 <w:szCs w:val="20"/>
               </w:rPr>
-              <w:t>(</w:t>
+              <w:t xml:space="preserve"> </w:t>
             </w:r>
             <w:proofErr w:type="spellStart"/>
             <w:r>
@@ -1854,6 +1800,41 @@
                 <w:sz w:val="20"/>
                 <w:szCs w:val="20"/>
               </w:rPr>
+              <w:t>is</w:t>
+            </w:r>
+            <w:proofErr w:type="spellEnd"/>
+            <w:r>
+              <w:rPr>
+                <w:rFonts w:eastAsiaTheme="majorEastAsia"/>
+                <w:sz w:val="20"/>
+                <w:szCs w:val="20"/>
+              </w:rPr>
+              <w:t xml:space="preserve"> </w:t>
+            </w:r>
+            <w:proofErr w:type="spellStart"/>
+            <w:r>
+              <w:rPr>
+                <w:rFonts w:eastAsiaTheme="majorEastAsia"/>
+                <w:sz w:val="20"/>
+                <w:szCs w:val="20"/>
+              </w:rPr>
+              <w:t>Actor</w:t>
+            </w:r>
+            <w:proofErr w:type="spellEnd"/>
+            <w:r>
+              <w:rPr>
+                <w:sz w:val="20"/>
+                <w:szCs w:val="20"/>
+              </w:rPr>
+              <w:t> и </w:t>
+            </w:r>
+            <w:proofErr w:type="spellStart"/>
+            <w:r>
+              <w:rPr>
+                <w:rFonts w:eastAsiaTheme="majorEastAsia"/>
+                <w:sz w:val="20"/>
+                <w:szCs w:val="20"/>
+              </w:rPr>
               <w:t>body</w:t>
             </w:r>
             <w:proofErr w:type="spellEnd"/>
@@ -1863,95 +1844,7 @@
                 <w:sz w:val="20"/>
                 <w:szCs w:val="20"/>
               </w:rPr>
-              <w:t>)</w:t>
-            </w:r>
-            <w:r>
-              <w:rPr>
-                <w:sz w:val="20"/>
-                <w:szCs w:val="20"/>
-              </w:rPr>
-              <w:t> добавлена проверка </w:t>
-            </w:r>
-            <w:proofErr w:type="spellStart"/>
-            <w:r>
-              <w:rPr>
-                <w:rFonts w:eastAsiaTheme="majorEastAsia"/>
-                <w:sz w:val="20"/>
-                <w:szCs w:val="20"/>
-              </w:rPr>
-              <w:t>body</w:t>
-            </w:r>
-            <w:proofErr w:type="spellEnd"/>
-            <w:r>
-              <w:rPr>
-                <w:rFonts w:eastAsiaTheme="majorEastAsia"/>
-                <w:sz w:val="20"/>
-                <w:szCs w:val="20"/>
-              </w:rPr>
-              <w:t xml:space="preserve"> </w:t>
-            </w:r>
-            <w:proofErr w:type="spellStart"/>
-            <w:r>
-              <w:rPr>
-                <w:rFonts w:eastAsiaTheme="majorEastAsia"/>
-                <w:sz w:val="20"/>
-                <w:szCs w:val="20"/>
-              </w:rPr>
-              <w:t>is</w:t>
-            </w:r>
-            <w:proofErr w:type="spellEnd"/>
-            <w:r>
-              <w:rPr>
-                <w:rFonts w:eastAsiaTheme="majorEastAsia"/>
-                <w:sz w:val="20"/>
-                <w:szCs w:val="20"/>
-              </w:rPr>
-              <w:t xml:space="preserve"> </w:t>
-            </w:r>
-            <w:proofErr w:type="spellStart"/>
-            <w:r>
-              <w:rPr>
-                <w:rFonts w:eastAsiaTheme="majorEastAsia"/>
-                <w:sz w:val="20"/>
-                <w:szCs w:val="20"/>
-              </w:rPr>
-              <w:t>Actor</w:t>
-            </w:r>
-            <w:proofErr w:type="spellEnd"/>
-            <w:r>
-              <w:rPr>
-                <w:sz w:val="20"/>
-                <w:szCs w:val="20"/>
-              </w:rPr>
-              <w:t> и </w:t>
-            </w:r>
-            <w:proofErr w:type="spellStart"/>
-            <w:proofErr w:type="gramStart"/>
-            <w:r>
-              <w:rPr>
-                <w:rFonts w:eastAsiaTheme="majorEastAsia"/>
-                <w:sz w:val="20"/>
-                <w:szCs w:val="20"/>
-              </w:rPr>
-              <w:t>body</w:t>
-            </w:r>
-            <w:proofErr w:type="spellEnd"/>
-            <w:r>
-              <w:rPr>
-                <w:rFonts w:eastAsiaTheme="majorEastAsia"/>
-                <w:sz w:val="20"/>
-                <w:szCs w:val="20"/>
-              </w:rPr>
-              <w:t xml:space="preserve"> !</w:t>
-            </w:r>
-            <w:proofErr w:type="gramEnd"/>
-            <w:r>
-              <w:rPr>
-                <w:rFonts w:eastAsiaTheme="majorEastAsia"/>
-                <w:sz w:val="20"/>
-                <w:szCs w:val="20"/>
-              </w:rPr>
-              <w:t xml:space="preserve">= </w:t>
+              <w:t xml:space="preserve"> != </w:t>
             </w:r>
             <w:proofErr w:type="spellStart"/>
             <w:r>
@@ -2078,21 +1971,12 @@
               <w:t>Bug</w:t>
             </w:r>
             <w:proofErr w:type="spellEnd"/>
-            <w:proofErr w:type="gramStart"/>
-            <w:r>
-              <w:rPr>
-                <w:sz w:val="20"/>
-                <w:szCs w:val="20"/>
-              </w:rPr>
-              <w:t>: При</w:t>
-            </w:r>
-            <w:proofErr w:type="gramEnd"/>
-            <w:r>
-              <w:rPr>
-                <w:sz w:val="20"/>
-                <w:szCs w:val="20"/>
-              </w:rPr>
-              <w:t xml:space="preserve"> получении урона игрока притягивает к врагу. Visual </w:t>
+            <w:r>
+              <w:rPr>
+                <w:sz w:val="20"/>
+                <w:szCs w:val="20"/>
+              </w:rPr>
+              <w:t xml:space="preserve">: При получении урона игрока притягивает к врагу. Visual </w:t>
             </w:r>
             <w:proofErr w:type="spellStart"/>
             <w:r>
@@ -2243,27 +2127,7 @@
                 <w:szCs w:val="20"/>
                 <w:lang w:val="en-US"/>
               </w:rPr>
-              <w:t>_</w:t>
-            </w:r>
-            <w:proofErr w:type="gramStart"/>
-            <w:r>
-              <w:rPr>
-                <w:rFonts w:eastAsiaTheme="majorEastAsia"/>
-                <w:sz w:val="20"/>
-                <w:szCs w:val="20"/>
-                <w:lang w:val="en-US"/>
-              </w:rPr>
-              <w:t>ready(</w:t>
-            </w:r>
-            <w:proofErr w:type="gramEnd"/>
-            <w:r>
-              <w:rPr>
-                <w:rFonts w:eastAsiaTheme="majorEastAsia"/>
-                <w:sz w:val="20"/>
-                <w:szCs w:val="20"/>
-                <w:lang w:val="en-US"/>
-              </w:rPr>
-              <w:t>)</w:t>
+              <w:t>_ready()</w:t>
             </w:r>
             <w:r>
               <w:rPr>
@@ -2536,45 +2400,14 @@
               <w:t xml:space="preserve"> </w:t>
             </w:r>
             <w:proofErr w:type="spellStart"/>
-            <w:proofErr w:type="gramStart"/>
-            <w:r>
-              <w:rPr>
-                <w:rFonts w:eastAsiaTheme="majorEastAsia"/>
-                <w:sz w:val="20"/>
-                <w:szCs w:val="20"/>
-                <w:lang w:val="en-US"/>
-              </w:rPr>
-              <w:t>hitter.global</w:t>
-            </w:r>
-            <w:proofErr w:type="gramEnd"/>
-            <w:r>
-              <w:rPr>
-                <w:rFonts w:eastAsiaTheme="majorEastAsia"/>
-                <w:sz w:val="20"/>
-                <w:szCs w:val="20"/>
-                <w:lang w:val="en-US"/>
-              </w:rPr>
-              <w:t>_</w:t>
-            </w:r>
-            <w:proofErr w:type="gramStart"/>
-            <w:r>
-              <w:rPr>
-                <w:rFonts w:eastAsiaTheme="majorEastAsia"/>
-                <w:sz w:val="20"/>
-                <w:szCs w:val="20"/>
-                <w:lang w:val="en-US"/>
-              </w:rPr>
-              <w:t>position.direction</w:t>
-            </w:r>
-            <w:proofErr w:type="gramEnd"/>
-            <w:r>
-              <w:rPr>
-                <w:rFonts w:eastAsiaTheme="majorEastAsia"/>
-                <w:sz w:val="20"/>
-                <w:szCs w:val="20"/>
-                <w:lang w:val="en-US"/>
-              </w:rPr>
-              <w:t>_to</w:t>
+            <w:r>
+              <w:rPr>
+                <w:rFonts w:eastAsiaTheme="majorEastAsia"/>
+                <w:sz w:val="20"/>
+                <w:szCs w:val="20"/>
+                <w:lang w:val="en-US"/>
+              </w:rPr>
+              <w:t>hitter.global_position.direction_to</w:t>
             </w:r>
             <w:proofErr w:type="spellEnd"/>
             <w:r>
@@ -2851,17 +2684,7 @@
                 <w:szCs w:val="20"/>
                 <w:lang w:val="en-US"/>
               </w:rPr>
-              <w:t>is_on_</w:t>
-            </w:r>
-            <w:proofErr w:type="gramStart"/>
-            <w:r>
-              <w:rPr>
-                <w:rFonts w:eastAsiaTheme="majorEastAsia"/>
-                <w:sz w:val="20"/>
-                <w:szCs w:val="20"/>
-                <w:lang w:val="en-US"/>
-              </w:rPr>
-              <w:t>floor</w:t>
+              <w:t>is_on_floor</w:t>
             </w:r>
             <w:proofErr w:type="spellEnd"/>
             <w:r>
@@ -2871,17 +2694,7 @@
                 <w:szCs w:val="20"/>
                 <w:lang w:val="en-US"/>
               </w:rPr>
-              <w:t>(</w:t>
-            </w:r>
-            <w:proofErr w:type="gramEnd"/>
-            <w:r>
-              <w:rPr>
-                <w:rFonts w:eastAsiaTheme="majorEastAsia"/>
-                <w:sz w:val="20"/>
-                <w:szCs w:val="20"/>
-                <w:lang w:val="en-US"/>
-              </w:rPr>
-              <w:t xml:space="preserve">) and not </w:t>
+              <w:t xml:space="preserve">() and not </w:t>
             </w:r>
             <w:proofErr w:type="spellStart"/>
             <w:r>
@@ -2891,17 +2704,7 @@
                 <w:szCs w:val="20"/>
                 <w:lang w:val="en-US"/>
               </w:rPr>
-              <w:t>is_on_</w:t>
-            </w:r>
-            <w:proofErr w:type="gramStart"/>
-            <w:r>
-              <w:rPr>
-                <w:rFonts w:eastAsiaTheme="majorEastAsia"/>
-                <w:sz w:val="20"/>
-                <w:szCs w:val="20"/>
-                <w:lang w:val="en-US"/>
-              </w:rPr>
-              <w:t>wall</w:t>
+              <w:t>is_on_wall</w:t>
             </w:r>
             <w:proofErr w:type="spellEnd"/>
             <w:r>
@@ -2919,16 +2722,7 @@
                 <w:szCs w:val="20"/>
                 <w:lang w:val="en-US"/>
               </w:rPr>
-              <w:t>,</w:t>
-            </w:r>
-            <w:proofErr w:type="gramEnd"/>
-            <w:r>
-              <w:rPr>
-                <w:sz w:val="20"/>
-                <w:szCs w:val="20"/>
-                <w:lang w:val="en-US"/>
-              </w:rPr>
-              <w:t xml:space="preserve"> </w:t>
+              <w:t xml:space="preserve">, </w:t>
             </w:r>
             <w:r>
               <w:rPr>
@@ -3253,45 +3047,14 @@
               </w:rPr>
               <w:t xml:space="preserve"> </w:t>
             </w:r>
-            <w:proofErr w:type="gramStart"/>
-            <w:r>
-              <w:rPr>
-                <w:rFonts w:eastAsiaTheme="majorEastAsia"/>
-                <w:sz w:val="20"/>
-                <w:szCs w:val="20"/>
-                <w:lang w:val="en-US"/>
-              </w:rPr>
-              <w:t>player.player</w:t>
-            </w:r>
-            <w:proofErr w:type="gramEnd"/>
-            <w:r>
-              <w:rPr>
-                <w:rFonts w:eastAsiaTheme="majorEastAsia"/>
-                <w:sz w:val="20"/>
-                <w:szCs w:val="20"/>
-                <w:lang w:val="en-US"/>
-              </w:rPr>
-              <w:t>_lost_all_</w:t>
-            </w:r>
-            <w:proofErr w:type="gramStart"/>
-            <w:r>
-              <w:rPr>
-                <w:rFonts w:eastAsiaTheme="majorEastAsia"/>
-                <w:sz w:val="20"/>
-                <w:szCs w:val="20"/>
-                <w:lang w:val="en-US"/>
-              </w:rPr>
-              <w:t>health.connect</w:t>
-            </w:r>
-            <w:proofErr w:type="gramEnd"/>
-            <w:r>
-              <w:rPr>
-                <w:rFonts w:eastAsiaTheme="majorEastAsia"/>
-                <w:sz w:val="20"/>
-                <w:szCs w:val="20"/>
-                <w:lang w:val="en-US"/>
-              </w:rPr>
-              <w:t>(_on_player_lost_all_health)</w:t>
+            <w:r>
+              <w:rPr>
+                <w:rFonts w:eastAsiaTheme="majorEastAsia"/>
+                <w:sz w:val="20"/>
+                <w:szCs w:val="20"/>
+                <w:lang w:val="en-US"/>
+              </w:rPr>
+              <w:t>player.player_lost_all_health.connect(_on_player_lost_all_health)</w:t>
             </w:r>
             <w:r>
               <w:rPr>
@@ -3447,17 +3210,7 @@
                 <w:szCs w:val="20"/>
                 <w:lang w:val="en-US"/>
               </w:rPr>
-              <w:t>on_player_lost_all_</w:t>
-            </w:r>
-            <w:proofErr w:type="gramStart"/>
-            <w:r>
-              <w:rPr>
-                <w:rFonts w:eastAsiaTheme="majorEastAsia"/>
-                <w:sz w:val="20"/>
-                <w:szCs w:val="20"/>
-                <w:lang w:val="en-US"/>
-              </w:rPr>
-              <w:t>health</w:t>
+              <w:t>on_player_lost_all_health</w:t>
             </w:r>
             <w:proofErr w:type="spellEnd"/>
             <w:r>
@@ -3467,17 +3220,7 @@
                 <w:szCs w:val="20"/>
                 <w:lang w:val="en-US"/>
               </w:rPr>
-              <w:t>(</w:t>
-            </w:r>
-            <w:proofErr w:type="gramEnd"/>
-            <w:r>
-              <w:rPr>
-                <w:rFonts w:eastAsiaTheme="majorEastAsia"/>
-                <w:sz w:val="20"/>
-                <w:szCs w:val="20"/>
-                <w:lang w:val="en-US"/>
-              </w:rPr>
-              <w:t>): call</w:t>
+              <w:t>(): call</w:t>
             </w:r>
             <w:r>
               <w:rPr>
@@ -3834,7 +3577,6 @@
                 <w:szCs w:val="20"/>
               </w:rPr>
             </w:pPr>
-            <w:proofErr w:type="gramStart"/>
             <w:r>
               <w:rPr>
                 <w:sz w:val="20"/>
@@ -3851,21 +3593,12 @@
               <w:t>new</w:t>
             </w:r>
             <w:proofErr w:type="spellEnd"/>
-            <w:proofErr w:type="gramEnd"/>
-            <w:r>
-              <w:rPr>
-                <w:sz w:val="20"/>
-                <w:szCs w:val="20"/>
-              </w:rPr>
-              <w:t xml:space="preserve">() </w:t>
-            </w:r>
-            <w:proofErr w:type="gramStart"/>
-            <w:r>
-              <w:rPr>
-                <w:sz w:val="20"/>
-                <w:szCs w:val="20"/>
-              </w:rPr>
-              <w:t>вместо .</w:t>
+            <w:r>
+              <w:rPr>
+                <w:sz w:val="20"/>
+                <w:szCs w:val="20"/>
+              </w:rPr>
+              <w:t>() вместо .</w:t>
             </w:r>
             <w:proofErr w:type="spellStart"/>
             <w:r>
@@ -3876,7 +3609,6 @@
               <w:t>instantiate</w:t>
             </w:r>
             <w:proofErr w:type="spellEnd"/>
-            <w:proofErr w:type="gramEnd"/>
             <w:r>
               <w:rPr>
                 <w:sz w:val="20"/>
@@ -3951,7 +3683,6 @@
               <w:t xml:space="preserve">о </w:t>
             </w:r>
             <w:proofErr w:type="spellStart"/>
-            <w:proofErr w:type="gramStart"/>
             <w:r>
               <w:rPr>
                 <w:rFonts w:eastAsiaTheme="majorEastAsia"/>
@@ -3969,7 +3700,6 @@
               </w:rPr>
               <w:t>(</w:t>
             </w:r>
-            <w:proofErr w:type="gramEnd"/>
             <w:r>
               <w:rPr>
                 <w:rFonts w:eastAsiaTheme="majorEastAsia"/>
@@ -4243,7 +3973,6 @@
               </w:rPr>
               <w:t>_</w:t>
             </w:r>
-            <w:proofErr w:type="gramStart"/>
             <w:r>
               <w:rPr>
                 <w:rFonts w:eastAsiaTheme="majorEastAsia"/>
@@ -4263,7 +3992,6 @@
               </w:rPr>
               <w:t>(</w:t>
             </w:r>
-            <w:proofErr w:type="gramEnd"/>
             <w:r>
               <w:rPr>
                 <w:rFonts w:eastAsiaTheme="majorEastAsia"/>
@@ -4426,7 +4154,6 @@
               </w:rPr>
               <w:t>_</w:t>
             </w:r>
-            <w:proofErr w:type="gramStart"/>
             <w:r>
               <w:rPr>
                 <w:rFonts w:eastAsiaTheme="majorEastAsia"/>
@@ -4444,17 +4171,7 @@
                 <w:szCs w:val="20"/>
                 <w:lang w:val="en-US"/>
               </w:rPr>
-              <w:t>(</w:t>
-            </w:r>
-            <w:proofErr w:type="gramEnd"/>
-            <w:r>
-              <w:rPr>
-                <w:rFonts w:eastAsiaTheme="majorEastAsia"/>
-                <w:sz w:val="20"/>
-                <w:szCs w:val="20"/>
-                <w:lang w:val="en-US"/>
-              </w:rPr>
-              <w:t>)</w:t>
+              <w:t>()</w:t>
             </w:r>
             <w:r>
               <w:rPr>
@@ -4766,16 +4483,7 @@
                 <w:sz w:val="20"/>
                 <w:szCs w:val="20"/>
               </w:rPr>
-              <w:t>test_set_up_camera_limit_takes_negative_</w:t>
-            </w:r>
-            <w:proofErr w:type="gramStart"/>
-            <w:r>
-              <w:rPr>
-                <w:rFonts w:eastAsiaTheme="majorEastAsia"/>
-                <w:sz w:val="20"/>
-                <w:szCs w:val="20"/>
-              </w:rPr>
-              <w:t>rect</w:t>
+              <w:t>test_set_up_camera_limit_takes_negative_rect</w:t>
             </w:r>
             <w:proofErr w:type="spellEnd"/>
             <w:r>
@@ -4784,16 +4492,7 @@
                 <w:sz w:val="20"/>
                 <w:szCs w:val="20"/>
               </w:rPr>
-              <w:t>(</w:t>
-            </w:r>
-            <w:proofErr w:type="gramEnd"/>
-            <w:r>
-              <w:rPr>
-                <w:rFonts w:eastAsiaTheme="majorEastAsia"/>
-                <w:sz w:val="20"/>
-                <w:szCs w:val="20"/>
-              </w:rPr>
-              <w:t>)</w:t>
+              <w:t>()</w:t>
             </w:r>
             <w:r>
               <w:rPr>
@@ -4857,15 +4556,7 @@
                 <w:sz w:val="20"/>
                 <w:szCs w:val="20"/>
               </w:rPr>
-              <w:t>(</w:t>
-            </w:r>
-            <w:proofErr w:type="gramStart"/>
-            <w:r>
-              <w:rPr>
-                <w:sz w:val="20"/>
-                <w:szCs w:val="20"/>
-              </w:rPr>
-              <w:t>использует </w:t>
+              <w:t>(использует </w:t>
             </w:r>
             <w:r>
               <w:rPr>
@@ -4885,7 +4576,6 @@
               <w:t>abs</w:t>
             </w:r>
             <w:proofErr w:type="spellEnd"/>
-            <w:proofErr w:type="gramEnd"/>
             <w:r>
               <w:rPr>
                 <w:rFonts w:eastAsiaTheme="majorEastAsia"/>
@@ -4943,16 +4633,7 @@
                 <w:sz w:val="20"/>
                 <w:szCs w:val="20"/>
               </w:rPr>
-              <w:t>test_knockback_pushes_player_</w:t>
-            </w:r>
-            <w:proofErr w:type="gramStart"/>
-            <w:r>
-              <w:rPr>
-                <w:rFonts w:eastAsiaTheme="majorEastAsia"/>
-                <w:sz w:val="20"/>
-                <w:szCs w:val="20"/>
-              </w:rPr>
-              <w:t>backwards</w:t>
+              <w:t>test_knockback_pushes_player_backwards</w:t>
             </w:r>
             <w:proofErr w:type="spellEnd"/>
             <w:r>
@@ -4961,16 +4642,7 @@
                 <w:sz w:val="20"/>
                 <w:szCs w:val="20"/>
               </w:rPr>
-              <w:t>(</w:t>
-            </w:r>
-            <w:proofErr w:type="gramEnd"/>
-            <w:r>
-              <w:rPr>
-                <w:rFonts w:eastAsiaTheme="majorEastAsia"/>
-                <w:sz w:val="20"/>
-                <w:szCs w:val="20"/>
-              </w:rPr>
-              <w:t>)</w:t>
+              <w:t>()</w:t>
             </w:r>
             <w:r>
               <w:rPr>
@@ -5068,18 +4740,8 @@
                 <w:sz w:val="20"/>
                 <w:szCs w:val="20"/>
               </w:rPr>
-              <w:t xml:space="preserve"> </w:t>
-            </w:r>
-            <w:proofErr w:type="gramStart"/>
-            <w:r>
-              <w:rPr>
-                <w:rFonts w:eastAsiaTheme="majorEastAsia"/>
-                <w:sz w:val="20"/>
-                <w:szCs w:val="20"/>
-              </w:rPr>
-              <w:t>&lt; 0</w:t>
-            </w:r>
-            <w:proofErr w:type="gramEnd"/>
+              <w:t xml:space="preserve"> &lt; 0</w:t>
+            </w:r>
             <w:r>
               <w:rPr>
                 <w:sz w:val="20"/>
@@ -5310,26 +4972,17 @@
                 <w:sz w:val="16"/>
                 <w:szCs w:val="16"/>
               </w:rPr>
-              <w:t xml:space="preserve">Метод создания объектов: В ТЗ не указано различие между созданием класса и инстансом сцены. В результате тесты </w:t>
-            </w:r>
-            <w:proofErr w:type="gramStart"/>
+              <w:t>Метод создания объектов: В ТЗ не указано различие между созданием класса и инстансом сцены. В результате тесты используют .</w:t>
+            </w:r>
+            <w:proofErr w:type="spellStart"/>
             <w:r>
               <w:rPr>
                 <w:sz w:val="16"/>
                 <w:szCs w:val="16"/>
               </w:rPr>
-              <w:t>используют .</w:t>
-            </w:r>
-            <w:proofErr w:type="spellStart"/>
-            <w:r>
-              <w:rPr>
-                <w:sz w:val="16"/>
-                <w:szCs w:val="16"/>
-              </w:rPr>
               <w:t>new</w:t>
             </w:r>
             <w:proofErr w:type="spellEnd"/>
-            <w:proofErr w:type="gramEnd"/>
             <w:r>
               <w:rPr>
                 <w:sz w:val="16"/>
@@ -5547,23 +5200,7 @@
                 <w:sz w:val="16"/>
                 <w:szCs w:val="16"/>
               </w:rPr>
-              <w:t>Типизация</w:t>
-            </w:r>
-            <w:proofErr w:type="gramStart"/>
-            <w:r>
-              <w:rPr>
-                <w:sz w:val="16"/>
-                <w:szCs w:val="16"/>
-              </w:rPr>
-              <w:t>: Запретить</w:t>
-            </w:r>
-            <w:proofErr w:type="gramEnd"/>
-            <w:r>
-              <w:rPr>
-                <w:sz w:val="16"/>
-                <w:szCs w:val="16"/>
-              </w:rPr>
-              <w:t xml:space="preserve"> использование </w:t>
+              <w:t xml:space="preserve">Типизация: Запретить использование </w:t>
             </w:r>
             <w:proofErr w:type="spellStart"/>
             <w:r>
@@ -5662,42 +5299,17 @@
                 <w:sz w:val="16"/>
                 <w:szCs w:val="16"/>
               </w:rPr>
-              <w:t>Стандарт тестов</w:t>
-            </w:r>
-            <w:proofErr w:type="gramStart"/>
+              <w:t>Стандарт тестов: Прописать обязательное использование .</w:t>
+            </w:r>
+            <w:proofErr w:type="spellStart"/>
             <w:r>
               <w:rPr>
                 <w:sz w:val="16"/>
                 <w:szCs w:val="16"/>
               </w:rPr>
-              <w:t>: Прописать</w:t>
-            </w:r>
-            <w:proofErr w:type="gramEnd"/>
-            <w:r>
-              <w:rPr>
-                <w:sz w:val="16"/>
-                <w:szCs w:val="16"/>
-              </w:rPr>
-              <w:t xml:space="preserve"> обязательное </w:t>
-            </w:r>
-            <w:proofErr w:type="gramStart"/>
-            <w:r>
-              <w:rPr>
-                <w:sz w:val="16"/>
-                <w:szCs w:val="16"/>
-              </w:rPr>
-              <w:t>использование .</w:t>
-            </w:r>
-            <w:proofErr w:type="spellStart"/>
-            <w:r>
-              <w:rPr>
-                <w:sz w:val="16"/>
-                <w:szCs w:val="16"/>
-              </w:rPr>
               <w:t>instantiate</w:t>
             </w:r>
             <w:proofErr w:type="spellEnd"/>
-            <w:proofErr w:type="gramEnd"/>
             <w:r>
               <w:rPr>
                 <w:sz w:val="16"/>
@@ -5814,7 +5426,7 @@
     <w:p>
       <w:pPr>
         <w:rPr>
-          <w:lang w:val="en-US"/>
+          <w:lang w:val="ru-MD"/>
         </w:rPr>
       </w:pPr>
       <w:r>
@@ -5846,7 +5458,7 @@
           <w:kern w:val="2"/>
           <w:sz w:val="32"/>
           <w:szCs w:val="32"/>
-          <w:lang w:val="en-US"/>
+          <w:lang w:val="ru-MD"/>
           <w14:ligatures w14:val="standardContextual"/>
         </w:rPr>
       </w:pPr>
@@ -5856,13 +5468,16 @@
     </w:p>
     <w:p>
       <w:pPr>
-        <w:pStyle w:val="Heading1"/>
+        <w:pStyle w:val="1"/>
         <w:rPr>
           <w:lang w:val="ru-RU"/>
         </w:rPr>
       </w:pPr>
-      <w:bookmarkStart w:id="2" w:name="_Toc225723118"/>
-      <w:r>
+      <w:bookmarkStart w:id="2" w:name="_Toc225776826"/>
+      <w:r>
+        <w:rPr>
+          <w:lang w:val="ru-MD"/>
+        </w:rPr>
         <w:lastRenderedPageBreak/>
         <w:t>ВЫВОДЫ</w:t>
       </w:r>
@@ -5906,7 +5521,7 @@
 </file>
 
 <file path=word/numbering.xml><?xml version="1.0" encoding="utf-8"?>
-<w:numbering xmlns:wpc="http://schemas.microsoft.com/office/word/2010/wordprocessingCanvas" xmlns:cx="http://schemas.microsoft.com/office/drawing/2014/chartex" xmlns:cx1="http://schemas.microsoft.com/office/drawing/2015/9/8/chartex" xmlns:cx2="http://schemas.microsoft.com/office/drawing/2015/10/21/chartex" xmlns:cx3="http://schemas.microsoft.com/office/drawing/2016/5/9/chartex" xmlns:cx4="http://schemas.microsoft.com/office/drawing/2016/5/10/chartex" xmlns:cx5="http://schemas.microsoft.com/office/drawing/2016/5/11/chartex" xmlns:cx6="http://schemas.microsoft.com/office/drawing/2016/5/12/chartex" xmlns:cx7="http://schemas.microsoft.com/office/drawing/2016/5/13/chartex" xmlns:cx8="http://schemas.microsoft.com/office/drawing/2016/5/14/chartex" xmlns:mc="http://schemas.openxmlformats.org/markup-compatibility/2006" xmlns:aink="http://schemas.microsoft.com/office/drawing/2016/ink" xmlns:am3d="http://schemas.microsoft.com/office/drawing/2017/model3d" xmlns:o="urn:schemas-microsoft-com:office:office" xmlns:oel="http://schemas.microsoft.com/office/2019/extlst" xmlns:r="http://schemas.openxmlformats.org/officeDocument/2006/relationships" xmlns:m="http://schemas.openxmlformats.org/officeDocument/2006/math" xmlns:v="urn:schemas-microsoft-com:vml" xmlns:wp14="http://schemas.microsoft.com/office/word/2010/wordprocessingDrawing" xmlns:wp="http://schemas.openxmlformats.org/drawingml/2006/wordprocessingDrawing" xmlns:w10="urn:schemas-microsoft-com:office:word" xmlns:w="http://schemas.openxmlformats.org/wordprocessingml/2006/main" xmlns:w14="http://schemas.microsoft.com/office/word/2010/wordml" xmlns:w15="http://schemas.microsoft.com/office/word/2012/wordml" xmlns:w16cex="http://schemas.microsoft.com/office/word/2018/wordml/cex" xmlns:w16cid="http://schemas.microsoft.com/office/word/2016/wordml/cid" xmlns:w16="http://schemas.microsoft.com/office/word/2018/wordml" xmlns:w16du="http://schemas.microsoft.com/office/word/2023/wordml/word16du" xmlns:w16sdtdh="http://schemas.microsoft.com/office/word/2020/wordml/sdtdatahash" xmlns:w16sdtfl="http://schemas.microsoft.com/office/word/2024/wordml/sdtformatlock" xmlns:w16se="http://schemas.microsoft.com/office/word/2015/wordml/symex" xmlns:wpg="http://schemas.microsoft.com/office/word/2010/wordprocessingGroup" xmlns:wpi="http://schemas.microsoft.com/office/word/2010/wordprocessingInk" xmlns:wne="http://schemas.microsoft.com/office/word/2006/wordml" xmlns:wps="http://schemas.microsoft.com/office/word/2010/wordprocessingShape" mc:Ignorable="w14 w15 w16se w16cid w16 w16cex w16sdtdh w16sdtfl w16du wp14">
+<w:numbering xmlns:wpc="http://schemas.microsoft.com/office/word/2010/wordprocessingCanvas" xmlns:cx="http://schemas.microsoft.com/office/drawing/2014/chartex" xmlns:cx1="http://schemas.microsoft.com/office/drawing/2015/9/8/chartex" xmlns:cx2="http://schemas.microsoft.com/office/drawing/2015/10/21/chartex" xmlns:cx3="http://schemas.microsoft.com/office/drawing/2016/5/9/chartex" xmlns:cx4="http://schemas.microsoft.com/office/drawing/2016/5/10/chartex" xmlns:cx5="http://schemas.microsoft.com/office/drawing/2016/5/11/chartex" xmlns:cx6="http://schemas.microsoft.com/office/drawing/2016/5/12/chartex" xmlns:cx7="http://schemas.microsoft.com/office/drawing/2016/5/13/chartex" xmlns:cx8="http://schemas.microsoft.com/office/drawing/2016/5/14/chartex" xmlns:mc="http://schemas.openxmlformats.org/markup-compatibility/2006" xmlns:aink="http://schemas.microsoft.com/office/drawing/2016/ink" xmlns:am3d="http://schemas.microsoft.com/office/drawing/2017/model3d" xmlns:o="urn:schemas-microsoft-com:office:office" xmlns:r="http://schemas.openxmlformats.org/officeDocument/2006/relationships" xmlns:m="http://schemas.openxmlformats.org/officeDocument/2006/math" xmlns:v="urn:schemas-microsoft-com:vml" xmlns:wp14="http://schemas.microsoft.com/office/word/2010/wordprocessingDrawing" xmlns:wp="http://schemas.openxmlformats.org/drawingml/2006/wordprocessingDrawing" xmlns:w10="urn:schemas-microsoft-com:office:word" xmlns:w="http://schemas.openxmlformats.org/wordprocessingml/2006/main" xmlns:w14="http://schemas.microsoft.com/office/word/2010/wordml" xmlns:w15="http://schemas.microsoft.com/office/word/2012/wordml" xmlns:w16cex="http://schemas.microsoft.com/office/word/2018/wordml/cex" xmlns:w16cid="http://schemas.microsoft.com/office/word/2016/wordml/cid" xmlns:w16="http://schemas.microsoft.com/office/word/2018/wordml" xmlns:w16sdtdh="http://schemas.microsoft.com/office/word/2020/wordml/sdtdatahash" xmlns:w16se="http://schemas.microsoft.com/office/word/2015/wordml/symex" xmlns:wpg="http://schemas.microsoft.com/office/word/2010/wordprocessingGroup" xmlns:wpi="http://schemas.microsoft.com/office/word/2010/wordprocessingInk" xmlns:wne="http://schemas.microsoft.com/office/word/2006/wordml" xmlns:wps="http://schemas.microsoft.com/office/word/2010/wordprocessingShape" mc:Ignorable="w14 w15 w16se w16cid w16 w16cex w16sdtdh wp14">
   <w:abstractNum w:abstractNumId="0" w15:restartNumberingAfterBreak="0">
     <w:nsid w:val="142F12A9"/>
     <w:multiLevelType w:val="hybridMultilevel"/>
@@ -6195,20 +5810,20 @@
       </w:pPr>
     </w:lvl>
   </w:abstractNum>
-  <w:num w:numId="1" w16cid:durableId="1966887898">
+  <w:num w:numId="1">
     <w:abstractNumId w:val="0"/>
   </w:num>
-  <w:num w:numId="2" w16cid:durableId="1051147867">
+  <w:num w:numId="2">
     <w:abstractNumId w:val="1"/>
   </w:num>
-  <w:num w:numId="3" w16cid:durableId="1768041214">
+  <w:num w:numId="3">
     <w:abstractNumId w:val="2"/>
   </w:num>
 </w:numbering>
 </file>
 
 <file path=word/styles.xml><?xml version="1.0" encoding="utf-8"?>
-<w:styles xmlns:mc="http://schemas.openxmlformats.org/markup-compatibility/2006" xmlns:r="http://schemas.openxmlformats.org/officeDocument/2006/relationships" xmlns:w="http://schemas.openxmlformats.org/wordprocessingml/2006/main" xmlns:w14="http://schemas.microsoft.com/office/word/2010/wordml" xmlns:w15="http://schemas.microsoft.com/office/word/2012/wordml" xmlns:w16cex="http://schemas.microsoft.com/office/word/2018/wordml/cex" xmlns:w16cid="http://schemas.microsoft.com/office/word/2016/wordml/cid" xmlns:w16="http://schemas.microsoft.com/office/word/2018/wordml" xmlns:w16du="http://schemas.microsoft.com/office/word/2023/wordml/word16du" xmlns:w16sdtdh="http://schemas.microsoft.com/office/word/2020/wordml/sdtdatahash" xmlns:w16sdtfl="http://schemas.microsoft.com/office/word/2024/wordml/sdtformatlock" xmlns:w16se="http://schemas.microsoft.com/office/word/2015/wordml/symex" mc:Ignorable="w14 w15 w16se w16cid w16 w16cex w16sdtdh w16sdtfl w16du">
+<w:styles xmlns:mc="http://schemas.openxmlformats.org/markup-compatibility/2006" xmlns:r="http://schemas.openxmlformats.org/officeDocument/2006/relationships" xmlns:w="http://schemas.openxmlformats.org/wordprocessingml/2006/main" xmlns:w14="http://schemas.microsoft.com/office/word/2010/wordml" xmlns:w15="http://schemas.microsoft.com/office/word/2012/wordml" xmlns:w16cex="http://schemas.microsoft.com/office/word/2018/wordml/cex" xmlns:w16cid="http://schemas.microsoft.com/office/word/2016/wordml/cid" xmlns:w16="http://schemas.microsoft.com/office/word/2018/wordml" xmlns:w16sdtdh="http://schemas.microsoft.com/office/word/2020/wordml/sdtdatahash" xmlns:w16se="http://schemas.microsoft.com/office/word/2015/wordml/symex" mc:Ignorable="w14 w15 w16se w16cid w16 w16cex w16sdtdh">
   <w:docDefaults>
     <w:rPrDefault>
       <w:rPr>
@@ -6604,7 +6219,7 @@
     <w:lsdException w:name="Unresolved Mention" w:semiHidden="1" w:unhideWhenUsed="1"/>
     <w:lsdException w:name="Smart Link" w:semiHidden="1" w:unhideWhenUsed="1"/>
   </w:latentStyles>
-  <w:style w:type="paragraph" w:default="1" w:styleId="Normal">
+  <w:style w:type="paragraph" w:default="1" w:styleId="a">
     <w:name w:val="Normal"/>
     <w:qFormat/>
     <w:rsid w:val="00ED7389"/>
@@ -6620,11 +6235,11 @@
       <w14:ligatures w14:val="none"/>
     </w:rPr>
   </w:style>
-  <w:style w:type="paragraph" w:styleId="Heading1">
+  <w:style w:type="paragraph" w:styleId="1">
     <w:name w:val="heading 1"/>
-    <w:basedOn w:val="Normal"/>
-    <w:next w:val="Normal"/>
-    <w:link w:val="Heading1Char"/>
+    <w:basedOn w:val="a"/>
+    <w:next w:val="a"/>
+    <w:link w:val="10"/>
     <w:uiPriority w:val="9"/>
     <w:qFormat/>
     <w:rsid w:val="00493BDB"/>
@@ -6647,11 +6262,11 @@
       <w14:ligatures w14:val="standardContextual"/>
     </w:rPr>
   </w:style>
-  <w:style w:type="paragraph" w:styleId="Heading2">
+  <w:style w:type="paragraph" w:styleId="2">
     <w:name w:val="heading 2"/>
-    <w:basedOn w:val="Normal"/>
-    <w:next w:val="Normal"/>
-    <w:link w:val="Heading2Char"/>
+    <w:basedOn w:val="a"/>
+    <w:next w:val="a"/>
+    <w:link w:val="20"/>
     <w:uiPriority w:val="9"/>
     <w:semiHidden/>
     <w:unhideWhenUsed/>
@@ -6670,11 +6285,11 @@
       <w:szCs w:val="32"/>
     </w:rPr>
   </w:style>
-  <w:style w:type="paragraph" w:styleId="Heading3">
+  <w:style w:type="paragraph" w:styleId="3">
     <w:name w:val="heading 3"/>
-    <w:basedOn w:val="Normal"/>
-    <w:next w:val="Normal"/>
-    <w:link w:val="Heading3Char"/>
+    <w:basedOn w:val="a"/>
+    <w:next w:val="a"/>
+    <w:link w:val="30"/>
     <w:uiPriority w:val="9"/>
     <w:semiHidden/>
     <w:unhideWhenUsed/>
@@ -6693,11 +6308,11 @@
       <w:szCs w:val="28"/>
     </w:rPr>
   </w:style>
-  <w:style w:type="paragraph" w:styleId="Heading4">
+  <w:style w:type="paragraph" w:styleId="4">
     <w:name w:val="heading 4"/>
-    <w:basedOn w:val="Normal"/>
-    <w:next w:val="Normal"/>
-    <w:link w:val="Heading4Char"/>
+    <w:basedOn w:val="a"/>
+    <w:next w:val="a"/>
+    <w:link w:val="40"/>
     <w:uiPriority w:val="9"/>
     <w:semiHidden/>
     <w:unhideWhenUsed/>
@@ -6716,11 +6331,11 @@
       <w:color w:val="0F4761" w:themeColor="accent1" w:themeShade="BF"/>
     </w:rPr>
   </w:style>
-  <w:style w:type="paragraph" w:styleId="Heading5">
+  <w:style w:type="paragraph" w:styleId="5">
     <w:name w:val="heading 5"/>
-    <w:basedOn w:val="Normal"/>
-    <w:next w:val="Normal"/>
-    <w:link w:val="Heading5Char"/>
+    <w:basedOn w:val="a"/>
+    <w:next w:val="a"/>
+    <w:link w:val="50"/>
     <w:uiPriority w:val="9"/>
     <w:semiHidden/>
     <w:unhideWhenUsed/>
@@ -6737,11 +6352,11 @@
       <w:color w:val="0F4761" w:themeColor="accent1" w:themeShade="BF"/>
     </w:rPr>
   </w:style>
-  <w:style w:type="paragraph" w:styleId="Heading6">
+  <w:style w:type="paragraph" w:styleId="6">
     <w:name w:val="heading 6"/>
-    <w:basedOn w:val="Normal"/>
-    <w:next w:val="Normal"/>
-    <w:link w:val="Heading6Char"/>
+    <w:basedOn w:val="a"/>
+    <w:next w:val="a"/>
+    <w:link w:val="60"/>
     <w:uiPriority w:val="9"/>
     <w:semiHidden/>
     <w:unhideWhenUsed/>
@@ -6760,11 +6375,11 @@
       <w:color w:val="595959" w:themeColor="text1" w:themeTint="A6"/>
     </w:rPr>
   </w:style>
-  <w:style w:type="paragraph" w:styleId="Heading7">
+  <w:style w:type="paragraph" w:styleId="7">
     <w:name w:val="heading 7"/>
-    <w:basedOn w:val="Normal"/>
-    <w:next w:val="Normal"/>
-    <w:link w:val="Heading7Char"/>
+    <w:basedOn w:val="a"/>
+    <w:next w:val="a"/>
+    <w:link w:val="70"/>
     <w:uiPriority w:val="9"/>
     <w:semiHidden/>
     <w:unhideWhenUsed/>
@@ -6781,11 +6396,11 @@
       <w:color w:val="595959" w:themeColor="text1" w:themeTint="A6"/>
     </w:rPr>
   </w:style>
-  <w:style w:type="paragraph" w:styleId="Heading8">
+  <w:style w:type="paragraph" w:styleId="8">
     <w:name w:val="heading 8"/>
-    <w:basedOn w:val="Normal"/>
-    <w:next w:val="Normal"/>
-    <w:link w:val="Heading8Char"/>
+    <w:basedOn w:val="a"/>
+    <w:next w:val="a"/>
+    <w:link w:val="80"/>
     <w:uiPriority w:val="9"/>
     <w:semiHidden/>
     <w:unhideWhenUsed/>
@@ -6803,11 +6418,11 @@
       <w:color w:val="272727" w:themeColor="text1" w:themeTint="D8"/>
     </w:rPr>
   </w:style>
-  <w:style w:type="paragraph" w:styleId="Heading9">
+  <w:style w:type="paragraph" w:styleId="9">
     <w:name w:val="heading 9"/>
-    <w:basedOn w:val="Normal"/>
-    <w:next w:val="Normal"/>
-    <w:link w:val="Heading9Char"/>
+    <w:basedOn w:val="a"/>
+    <w:next w:val="a"/>
+    <w:link w:val="90"/>
     <w:uiPriority w:val="9"/>
     <w:semiHidden/>
     <w:unhideWhenUsed/>
@@ -6823,13 +6438,13 @@
       <w:color w:val="272727" w:themeColor="text1" w:themeTint="D8"/>
     </w:rPr>
   </w:style>
-  <w:style w:type="character" w:default="1" w:styleId="DefaultParagraphFont">
+  <w:style w:type="character" w:default="1" w:styleId="a0">
     <w:name w:val="Default Paragraph Font"/>
     <w:uiPriority w:val="1"/>
     <w:semiHidden/>
     <w:unhideWhenUsed/>
   </w:style>
-  <w:style w:type="table" w:default="1" w:styleId="TableNormal">
+  <w:style w:type="table" w:default="1" w:styleId="a1">
     <w:name w:val="Normal Table"/>
     <w:uiPriority w:val="99"/>
     <w:semiHidden/>
@@ -6844,16 +6459,16 @@
       </w:tblCellMar>
     </w:tblPr>
   </w:style>
-  <w:style w:type="numbering" w:default="1" w:styleId="NoList">
+  <w:style w:type="numbering" w:default="1" w:styleId="a2">
     <w:name w:val="No List"/>
     <w:uiPriority w:val="99"/>
     <w:semiHidden/>
     <w:unhideWhenUsed/>
   </w:style>
-  <w:style w:type="character" w:customStyle="1" w:styleId="Heading1Char">
-    <w:name w:val="Heading 1 Char"/>
-    <w:basedOn w:val="DefaultParagraphFont"/>
-    <w:link w:val="Heading1"/>
+  <w:style w:type="character" w:customStyle="1" w:styleId="10">
+    <w:name w:val="Заголовок 1 Знак"/>
+    <w:basedOn w:val="a0"/>
+    <w:link w:val="1"/>
     <w:uiPriority w:val="9"/>
     <w:rsid w:val="00493BDB"/>
     <w:rPr>
@@ -6865,10 +6480,10 @@
       <w:szCs w:val="32"/>
     </w:rPr>
   </w:style>
-  <w:style w:type="character" w:customStyle="1" w:styleId="Heading2Char">
-    <w:name w:val="Heading 2 Char"/>
-    <w:basedOn w:val="DefaultParagraphFont"/>
-    <w:link w:val="Heading2"/>
+  <w:style w:type="character" w:customStyle="1" w:styleId="20">
+    <w:name w:val="Заголовок 2 Знак"/>
+    <w:basedOn w:val="a0"/>
+    <w:link w:val="2"/>
     <w:uiPriority w:val="9"/>
     <w:semiHidden/>
     <w:rsid w:val="00493BDB"/>
@@ -6879,10 +6494,10 @@
       <w:szCs w:val="32"/>
     </w:rPr>
   </w:style>
-  <w:style w:type="character" w:customStyle="1" w:styleId="Heading3Char">
-    <w:name w:val="Heading 3 Char"/>
-    <w:basedOn w:val="DefaultParagraphFont"/>
-    <w:link w:val="Heading3"/>
+  <w:style w:type="character" w:customStyle="1" w:styleId="30">
+    <w:name w:val="Заголовок 3 Знак"/>
+    <w:basedOn w:val="a0"/>
+    <w:link w:val="3"/>
     <w:uiPriority w:val="9"/>
     <w:semiHidden/>
     <w:rsid w:val="00493BDB"/>
@@ -6893,10 +6508,10 @@
       <w:szCs w:val="28"/>
     </w:rPr>
   </w:style>
-  <w:style w:type="character" w:customStyle="1" w:styleId="Heading4Char">
-    <w:name w:val="Heading 4 Char"/>
-    <w:basedOn w:val="DefaultParagraphFont"/>
-    <w:link w:val="Heading4"/>
+  <w:style w:type="character" w:customStyle="1" w:styleId="40">
+    <w:name w:val="Заголовок 4 Знак"/>
+    <w:basedOn w:val="a0"/>
+    <w:link w:val="4"/>
     <w:uiPriority w:val="9"/>
     <w:semiHidden/>
     <w:rsid w:val="00493BDB"/>
@@ -6907,10 +6522,10 @@
       <w:color w:val="0F4761" w:themeColor="accent1" w:themeShade="BF"/>
     </w:rPr>
   </w:style>
-  <w:style w:type="character" w:customStyle="1" w:styleId="Heading5Char">
-    <w:name w:val="Heading 5 Char"/>
-    <w:basedOn w:val="DefaultParagraphFont"/>
-    <w:link w:val="Heading5"/>
+  <w:style w:type="character" w:customStyle="1" w:styleId="50">
+    <w:name w:val="Заголовок 5 Знак"/>
+    <w:basedOn w:val="a0"/>
+    <w:link w:val="5"/>
     <w:uiPriority w:val="9"/>
     <w:semiHidden/>
     <w:rsid w:val="00493BDB"/>
@@ -6919,10 +6534,10 @@
       <w:color w:val="0F4761" w:themeColor="accent1" w:themeShade="BF"/>
     </w:rPr>
   </w:style>
-  <w:style w:type="character" w:customStyle="1" w:styleId="Heading6Char">
-    <w:name w:val="Heading 6 Char"/>
-    <w:basedOn w:val="DefaultParagraphFont"/>
-    <w:link w:val="Heading6"/>
+  <w:style w:type="character" w:customStyle="1" w:styleId="60">
+    <w:name w:val="Заголовок 6 Знак"/>
+    <w:basedOn w:val="a0"/>
+    <w:link w:val="6"/>
     <w:uiPriority w:val="9"/>
     <w:semiHidden/>
     <w:rsid w:val="00493BDB"/>
@@ -6933,10 +6548,10 @@
       <w:color w:val="595959" w:themeColor="text1" w:themeTint="A6"/>
     </w:rPr>
   </w:style>
-  <w:style w:type="character" w:customStyle="1" w:styleId="Heading7Char">
-    <w:name w:val="Heading 7 Char"/>
-    <w:basedOn w:val="DefaultParagraphFont"/>
-    <w:link w:val="Heading7"/>
+  <w:style w:type="character" w:customStyle="1" w:styleId="70">
+    <w:name w:val="Заголовок 7 Знак"/>
+    <w:basedOn w:val="a0"/>
+    <w:link w:val="7"/>
     <w:uiPriority w:val="9"/>
     <w:semiHidden/>
     <w:rsid w:val="00493BDB"/>
@@ -6945,10 +6560,10 @@
       <w:color w:val="595959" w:themeColor="text1" w:themeTint="A6"/>
     </w:rPr>
   </w:style>
-  <w:style w:type="character" w:customStyle="1" w:styleId="Heading8Char">
-    <w:name w:val="Heading 8 Char"/>
-    <w:basedOn w:val="DefaultParagraphFont"/>
-    <w:link w:val="Heading8"/>
+  <w:style w:type="character" w:customStyle="1" w:styleId="80">
+    <w:name w:val="Заголовок 8 Знак"/>
+    <w:basedOn w:val="a0"/>
+    <w:link w:val="8"/>
     <w:uiPriority w:val="9"/>
     <w:semiHidden/>
     <w:rsid w:val="00493BDB"/>
@@ -6959,10 +6574,10 @@
       <w:color w:val="272727" w:themeColor="text1" w:themeTint="D8"/>
     </w:rPr>
   </w:style>
-  <w:style w:type="character" w:customStyle="1" w:styleId="Heading9Char">
-    <w:name w:val="Heading 9 Char"/>
-    <w:basedOn w:val="DefaultParagraphFont"/>
-    <w:link w:val="Heading9"/>
+  <w:style w:type="character" w:customStyle="1" w:styleId="90">
+    <w:name w:val="Заголовок 9 Знак"/>
+    <w:basedOn w:val="a0"/>
+    <w:link w:val="9"/>
     <w:uiPriority w:val="9"/>
     <w:semiHidden/>
     <w:rsid w:val="00493BDB"/>
@@ -6971,11 +6586,11 @@
       <w:color w:val="272727" w:themeColor="text1" w:themeTint="D8"/>
     </w:rPr>
   </w:style>
-  <w:style w:type="paragraph" w:styleId="Title">
+  <w:style w:type="paragraph" w:styleId="a3">
     <w:name w:val="Title"/>
-    <w:basedOn w:val="Normal"/>
-    <w:next w:val="Normal"/>
-    <w:link w:val="TitleChar"/>
+    <w:basedOn w:val="a"/>
+    <w:next w:val="a"/>
+    <w:link w:val="a4"/>
     <w:uiPriority w:val="10"/>
     <w:qFormat/>
     <w:rsid w:val="00493BDB"/>
@@ -6991,10 +6606,10 @@
       <w:szCs w:val="56"/>
     </w:rPr>
   </w:style>
-  <w:style w:type="character" w:customStyle="1" w:styleId="TitleChar">
-    <w:name w:val="Title Char"/>
-    <w:basedOn w:val="DefaultParagraphFont"/>
-    <w:link w:val="Title"/>
+  <w:style w:type="character" w:customStyle="1" w:styleId="a4">
+    <w:name w:val="Заголовок Знак"/>
+    <w:basedOn w:val="a0"/>
+    <w:link w:val="a3"/>
     <w:uiPriority w:val="10"/>
     <w:rsid w:val="00493BDB"/>
     <w:rPr>
@@ -7005,11 +6620,11 @@
       <w:szCs w:val="56"/>
     </w:rPr>
   </w:style>
-  <w:style w:type="paragraph" w:styleId="Subtitle">
+  <w:style w:type="paragraph" w:styleId="a5">
     <w:name w:val="Subtitle"/>
-    <w:basedOn w:val="Normal"/>
-    <w:next w:val="Normal"/>
-    <w:link w:val="SubtitleChar"/>
+    <w:basedOn w:val="a"/>
+    <w:next w:val="a"/>
+    <w:link w:val="a6"/>
     <w:uiPriority w:val="11"/>
     <w:qFormat/>
     <w:rsid w:val="00493BDB"/>
@@ -7017,6 +6632,7 @@
       <w:numPr>
         <w:ilvl w:val="1"/>
       </w:numPr>
+      <w:ind w:firstLine="851"/>
     </w:pPr>
     <w:rPr>
       <w:rFonts w:eastAsiaTheme="majorEastAsia" w:cstheme="majorBidi"/>
@@ -7026,10 +6642,10 @@
       <w:szCs w:val="28"/>
     </w:rPr>
   </w:style>
-  <w:style w:type="character" w:customStyle="1" w:styleId="SubtitleChar">
-    <w:name w:val="Subtitle Char"/>
-    <w:basedOn w:val="DefaultParagraphFont"/>
-    <w:link w:val="Subtitle"/>
+  <w:style w:type="character" w:customStyle="1" w:styleId="a6">
+    <w:name w:val="Подзаголовок Знак"/>
+    <w:basedOn w:val="a0"/>
+    <w:link w:val="a5"/>
     <w:uiPriority w:val="11"/>
     <w:rsid w:val="00493BDB"/>
     <w:rPr>
@@ -7040,11 +6656,11 @@
       <w:szCs w:val="28"/>
     </w:rPr>
   </w:style>
-  <w:style w:type="paragraph" w:styleId="Quote">
+  <w:style w:type="paragraph" w:styleId="21">
     <w:name w:val="Quote"/>
-    <w:basedOn w:val="Normal"/>
-    <w:next w:val="Normal"/>
-    <w:link w:val="QuoteChar"/>
+    <w:basedOn w:val="a"/>
+    <w:next w:val="a"/>
+    <w:link w:val="22"/>
     <w:uiPriority w:val="29"/>
     <w:qFormat/>
     <w:rsid w:val="00493BDB"/>
@@ -7058,10 +6674,10 @@
       <w:color w:val="404040" w:themeColor="text1" w:themeTint="BF"/>
     </w:rPr>
   </w:style>
-  <w:style w:type="character" w:customStyle="1" w:styleId="QuoteChar">
-    <w:name w:val="Quote Char"/>
-    <w:basedOn w:val="DefaultParagraphFont"/>
-    <w:link w:val="Quote"/>
+  <w:style w:type="character" w:customStyle="1" w:styleId="22">
+    <w:name w:val="Цитата 2 Знак"/>
+    <w:basedOn w:val="a0"/>
+    <w:link w:val="21"/>
     <w:uiPriority w:val="29"/>
     <w:rsid w:val="00493BDB"/>
     <w:rPr>
@@ -7070,9 +6686,9 @@
       <w:color w:val="404040" w:themeColor="text1" w:themeTint="BF"/>
     </w:rPr>
   </w:style>
-  <w:style w:type="paragraph" w:styleId="ListParagraph">
+  <w:style w:type="paragraph" w:styleId="a7">
     <w:name w:val="List Paragraph"/>
-    <w:basedOn w:val="Normal"/>
+    <w:basedOn w:val="a"/>
     <w:uiPriority w:val="34"/>
     <w:qFormat/>
     <w:rsid w:val="00493BDB"/>
@@ -7081,9 +6697,9 @@
       <w:contextualSpacing/>
     </w:pPr>
   </w:style>
-  <w:style w:type="character" w:styleId="IntenseEmphasis">
+  <w:style w:type="character" w:styleId="a8">
     <w:name w:val="Intense Emphasis"/>
-    <w:basedOn w:val="DefaultParagraphFont"/>
+    <w:basedOn w:val="a0"/>
     <w:uiPriority w:val="21"/>
     <w:qFormat/>
     <w:rsid w:val="00493BDB"/>
@@ -7093,11 +6709,11 @@
       <w:color w:val="0F4761" w:themeColor="accent1" w:themeShade="BF"/>
     </w:rPr>
   </w:style>
-  <w:style w:type="paragraph" w:styleId="IntenseQuote">
+  <w:style w:type="paragraph" w:styleId="a9">
     <w:name w:val="Intense Quote"/>
-    <w:basedOn w:val="Normal"/>
-    <w:next w:val="Normal"/>
-    <w:link w:val="IntenseQuoteChar"/>
+    <w:basedOn w:val="a"/>
+    <w:next w:val="a"/>
+    <w:link w:val="aa"/>
     <w:uiPriority w:val="30"/>
     <w:qFormat/>
     <w:rsid w:val="00493BDB"/>
@@ -7116,10 +6732,10 @@
       <w:color w:val="0F4761" w:themeColor="accent1" w:themeShade="BF"/>
     </w:rPr>
   </w:style>
-  <w:style w:type="character" w:customStyle="1" w:styleId="IntenseQuoteChar">
-    <w:name w:val="Intense Quote Char"/>
-    <w:basedOn w:val="DefaultParagraphFont"/>
-    <w:link w:val="IntenseQuote"/>
+  <w:style w:type="character" w:customStyle="1" w:styleId="aa">
+    <w:name w:val="Выделенная цитата Знак"/>
+    <w:basedOn w:val="a0"/>
+    <w:link w:val="a9"/>
     <w:uiPriority w:val="30"/>
     <w:rsid w:val="00493BDB"/>
     <w:rPr>
@@ -7128,9 +6744,9 @@
       <w:color w:val="0F4761" w:themeColor="accent1" w:themeShade="BF"/>
     </w:rPr>
   </w:style>
-  <w:style w:type="character" w:styleId="IntenseReference">
+  <w:style w:type="character" w:styleId="ab">
     <w:name w:val="Intense Reference"/>
-    <w:basedOn w:val="DefaultParagraphFont"/>
+    <w:basedOn w:val="a0"/>
     <w:uiPriority w:val="32"/>
     <w:qFormat/>
     <w:rsid w:val="00493BDB"/>
@@ -7142,10 +6758,10 @@
       <w:spacing w:val="5"/>
     </w:rPr>
   </w:style>
-  <w:style w:type="paragraph" w:styleId="TOCHeading">
+  <w:style w:type="paragraph" w:styleId="ac">
     <w:name w:val="TOC Heading"/>
-    <w:basedOn w:val="Heading1"/>
-    <w:next w:val="Normal"/>
+    <w:basedOn w:val="1"/>
+    <w:next w:val="a"/>
     <w:uiPriority w:val="39"/>
     <w:unhideWhenUsed/>
     <w:qFormat/>
@@ -7165,10 +6781,10 @@
       <w14:ligatures w14:val="none"/>
     </w:rPr>
   </w:style>
-  <w:style w:type="paragraph" w:styleId="TOC1">
+  <w:style w:type="paragraph" w:styleId="11">
     <w:name w:val="toc 1"/>
-    <w:basedOn w:val="Normal"/>
-    <w:next w:val="Normal"/>
+    <w:basedOn w:val="a"/>
+    <w:next w:val="a"/>
     <w:autoRedefine/>
     <w:uiPriority w:val="39"/>
     <w:unhideWhenUsed/>
@@ -7185,9 +6801,9 @@
       <w:szCs w:val="20"/>
     </w:rPr>
   </w:style>
-  <w:style w:type="character" w:styleId="Hyperlink">
+  <w:style w:type="character" w:styleId="ad">
     <w:name w:val="Hyperlink"/>
-    <w:basedOn w:val="DefaultParagraphFont"/>
+    <w:basedOn w:val="a0"/>
     <w:uiPriority w:val="99"/>
     <w:unhideWhenUsed/>
     <w:rsid w:val="00493BDB"/>
@@ -7196,10 +6812,10 @@
       <w:u w:val="single"/>
     </w:rPr>
   </w:style>
-  <w:style w:type="paragraph" w:styleId="TOC2">
+  <w:style w:type="paragraph" w:styleId="23">
     <w:name w:val="toc 2"/>
-    <w:basedOn w:val="Normal"/>
-    <w:next w:val="Normal"/>
+    <w:basedOn w:val="a"/>
+    <w:next w:val="a"/>
     <w:autoRedefine/>
     <w:uiPriority w:val="39"/>
     <w:semiHidden/>
@@ -7215,10 +6831,10 @@
       <w:szCs w:val="20"/>
     </w:rPr>
   </w:style>
-  <w:style w:type="paragraph" w:styleId="TOC3">
+  <w:style w:type="paragraph" w:styleId="31">
     <w:name w:val="toc 3"/>
-    <w:basedOn w:val="Normal"/>
-    <w:next w:val="Normal"/>
+    <w:basedOn w:val="a"/>
+    <w:next w:val="a"/>
     <w:autoRedefine/>
     <w:uiPriority w:val="39"/>
     <w:semiHidden/>
@@ -7235,10 +6851,10 @@
       <w:szCs w:val="20"/>
     </w:rPr>
   </w:style>
-  <w:style w:type="paragraph" w:styleId="TOC4">
+  <w:style w:type="paragraph" w:styleId="41">
     <w:name w:val="toc 4"/>
-    <w:basedOn w:val="Normal"/>
-    <w:next w:val="Normal"/>
+    <w:basedOn w:val="a"/>
+    <w:next w:val="a"/>
     <w:autoRedefine/>
     <w:uiPriority w:val="39"/>
     <w:semiHidden/>
@@ -7253,10 +6869,10 @@
       <w:szCs w:val="18"/>
     </w:rPr>
   </w:style>
-  <w:style w:type="paragraph" w:styleId="TOC5">
+  <w:style w:type="paragraph" w:styleId="51">
     <w:name w:val="toc 5"/>
-    <w:basedOn w:val="Normal"/>
-    <w:next w:val="Normal"/>
+    <w:basedOn w:val="a"/>
+    <w:next w:val="a"/>
     <w:autoRedefine/>
     <w:uiPriority w:val="39"/>
     <w:semiHidden/>
@@ -7271,10 +6887,10 @@
       <w:szCs w:val="18"/>
     </w:rPr>
   </w:style>
-  <w:style w:type="paragraph" w:styleId="TOC6">
+  <w:style w:type="paragraph" w:styleId="61">
     <w:name w:val="toc 6"/>
-    <w:basedOn w:val="Normal"/>
-    <w:next w:val="Normal"/>
+    <w:basedOn w:val="a"/>
+    <w:next w:val="a"/>
     <w:autoRedefine/>
     <w:uiPriority w:val="39"/>
     <w:semiHidden/>
@@ -7289,10 +6905,10 @@
       <w:szCs w:val="18"/>
     </w:rPr>
   </w:style>
-  <w:style w:type="paragraph" w:styleId="TOC7">
+  <w:style w:type="paragraph" w:styleId="71">
     <w:name w:val="toc 7"/>
-    <w:basedOn w:val="Normal"/>
-    <w:next w:val="Normal"/>
+    <w:basedOn w:val="a"/>
+    <w:next w:val="a"/>
     <w:autoRedefine/>
     <w:uiPriority w:val="39"/>
     <w:semiHidden/>
@@ -7307,10 +6923,10 @@
       <w:szCs w:val="18"/>
     </w:rPr>
   </w:style>
-  <w:style w:type="paragraph" w:styleId="TOC8">
+  <w:style w:type="paragraph" w:styleId="81">
     <w:name w:val="toc 8"/>
-    <w:basedOn w:val="Normal"/>
-    <w:next w:val="Normal"/>
+    <w:basedOn w:val="a"/>
+    <w:next w:val="a"/>
     <w:autoRedefine/>
     <w:uiPriority w:val="39"/>
     <w:semiHidden/>
@@ -7325,10 +6941,10 @@
       <w:szCs w:val="18"/>
     </w:rPr>
   </w:style>
-  <w:style w:type="paragraph" w:styleId="TOC9">
+  <w:style w:type="paragraph" w:styleId="91">
     <w:name w:val="toc 9"/>
-    <w:basedOn w:val="Normal"/>
-    <w:next w:val="Normal"/>
+    <w:basedOn w:val="a"/>
+    <w:next w:val="a"/>
     <w:autoRedefine/>
     <w:uiPriority w:val="39"/>
     <w:semiHidden/>
@@ -7343,9 +6959,9 @@
       <w:szCs w:val="18"/>
     </w:rPr>
   </w:style>
-  <w:style w:type="character" w:styleId="FollowedHyperlink">
+  <w:style w:type="character" w:styleId="ae">
     <w:name w:val="FollowedHyperlink"/>
-    <w:basedOn w:val="DefaultParagraphFont"/>
+    <w:basedOn w:val="a0"/>
     <w:uiPriority w:val="99"/>
     <w:semiHidden/>
     <w:unhideWhenUsed/>

</xml_diff>